<commit_message>
Add README.md for FER-Pi5: a real-time facial expression recognition system on Raspberry Pi 5 using CNN and YuNet
</commit_message>
<xml_diff>
--- a/docs/22404010103_张吉鹏/22404010103_张吉鹏_附件10： 毕业设计（论文）答辩记录表.docx
+++ b/docs/22404010103_张吉鹏/22404010103_张吉鹏_附件10： 毕业设计（论文）答辩记录表.docx
@@ -708,28 +708,375 @@
           <w:p>
             <w:pPr>
               <w:spacing w:line="300" w:lineRule="auto"/>
-              <w:ind w:firstLineChars="200" w:firstLine="420"/>
-              <w:rPr>
-                <w:bCs/>
-                <w:szCs w:val="21"/>
-              </w:rPr>
-            </w:pPr>
-            <w:r>
-              <w:rPr>
-                <w:rFonts w:hint="eastAsia"/>
-                <w:bCs/>
-                <w:szCs w:val="21"/>
-              </w:rPr>
-              <w:t xml:space="preserve">                                  </w:t>
+            </w:pPr>
+            <w:r>
+              <w:rPr>
+                <w:rFonts w:hint="eastAsia"/>
+              </w:rPr>
+              <w:t>问题</w:t>
+            </w:r>
+            <w:r>
+              <w:rPr>
+                <w:rFonts w:hint="eastAsia"/>
+              </w:rPr>
+              <w:t>1</w:t>
+            </w:r>
+            <w:r>
+              <w:rPr>
+                <w:rFonts w:hint="eastAsia"/>
+              </w:rPr>
+              <w:t>：什么是</w:t>
+            </w:r>
+            <w:r>
+              <w:rPr>
+                <w:rFonts w:hint="eastAsia"/>
+              </w:rPr>
+              <w:t>CNN</w:t>
+            </w:r>
+            <w:r>
+              <w:rPr>
+                <w:rFonts w:hint="eastAsia"/>
+              </w:rPr>
+              <w:t>？它在你的表情识别项目中起什么作用？</w:t>
             </w:r>
           </w:p>
           <w:p>
             <w:pPr>
               <w:spacing w:line="300" w:lineRule="auto"/>
-              <w:rPr>
-                <w:bCs/>
-              </w:rPr>
-            </w:pPr>
+            </w:pPr>
+            <w:r>
+              <w:rPr>
+                <w:rFonts w:hint="eastAsia"/>
+              </w:rPr>
+              <w:t>CNN</w:t>
+            </w:r>
+            <w:r>
+              <w:rPr>
+                <w:rFonts w:hint="eastAsia"/>
+              </w:rPr>
+              <w:t>是一种专门处理图像这类网格结构数据的神经网络。我的项目里，</w:t>
+            </w:r>
+            <w:r>
+              <w:rPr>
+                <w:rFonts w:hint="eastAsia"/>
+              </w:rPr>
+              <w:t>MobileNetV3-Large</w:t>
+            </w:r>
+            <w:r>
+              <w:rPr>
+                <w:rFonts w:hint="eastAsia"/>
+              </w:rPr>
+              <w:t>的浅层卷积核学到的是边缘、纹理等通用特征，深层则组合出</w:t>
+            </w:r>
+            <w:r>
+              <w:rPr>
+                <w:rFonts w:hint="eastAsia"/>
+              </w:rPr>
+              <w:t>"</w:t>
+            </w:r>
+            <w:r>
+              <w:rPr>
+                <w:rFonts w:hint="eastAsia"/>
+              </w:rPr>
+              <w:t>嘴角上扬</w:t>
+            </w:r>
+            <w:r>
+              <w:rPr>
+                <w:rFonts w:hint="eastAsia"/>
+              </w:rPr>
+              <w:t>=happy""</w:t>
+            </w:r>
+            <w:r>
+              <w:rPr>
+                <w:rFonts w:hint="eastAsia"/>
+              </w:rPr>
+              <w:t>眉头紧锁</w:t>
+            </w:r>
+            <w:r>
+              <w:rPr>
+                <w:rFonts w:hint="eastAsia"/>
+              </w:rPr>
+              <w:t>=anger"</w:t>
+            </w:r>
+            <w:r>
+              <w:rPr>
+                <w:rFonts w:hint="eastAsia"/>
+              </w:rPr>
+              <w:t>这样的语义。</w:t>
+            </w:r>
+          </w:p>
+          <w:p>
+            <w:pPr>
+              <w:spacing w:line="300" w:lineRule="auto"/>
+            </w:pPr>
+            <w:r>
+              <w:rPr>
+                <w:rFonts w:hint="eastAsia"/>
+                <w:bCs/>
+              </w:rPr>
+              <w:t>问题</w:t>
+            </w:r>
+            <w:r>
+              <w:rPr>
+                <w:rFonts w:hint="eastAsia"/>
+                <w:bCs/>
+              </w:rPr>
+              <w:t>2</w:t>
+            </w:r>
+            <w:r>
+              <w:rPr>
+                <w:rFonts w:hint="eastAsia"/>
+                <w:bCs/>
+              </w:rPr>
+              <w:t>：</w:t>
+            </w:r>
+            <w:r>
+              <w:rPr>
+                <w:rFonts w:hint="eastAsia"/>
+              </w:rPr>
+              <w:t>什么是无标签数据？什么是伪标签？两者有什么区别？</w:t>
+            </w:r>
+          </w:p>
+          <w:p>
+            <w:pPr>
+              <w:spacing w:line="300" w:lineRule="auto"/>
+            </w:pPr>
+            <w:r>
+              <w:rPr>
+                <w:rFonts w:hint="eastAsia"/>
+              </w:rPr>
+              <w:t>无标签数据是指有图片但没有人工标注标签的数据。伪标签则是我用已经训练好的模型，对这些无标签数据做预测，把模型的高置信度预测结果当作</w:t>
+            </w:r>
+            <w:r>
+              <w:rPr>
+                <w:rFonts w:hint="eastAsia"/>
+              </w:rPr>
+              <w:t>"</w:t>
+            </w:r>
+            <w:r>
+              <w:rPr>
+                <w:rFonts w:hint="eastAsia"/>
+              </w:rPr>
+              <w:t>真标签</w:t>
+            </w:r>
+            <w:r>
+              <w:rPr>
+                <w:rFonts w:hint="eastAsia"/>
+              </w:rPr>
+              <w:t>"</w:t>
+            </w:r>
+            <w:r>
+              <w:rPr>
+                <w:rFonts w:hint="eastAsia"/>
+              </w:rPr>
+              <w:t>赋给这些数据。两者的本质区别在于：无标签数据的标签是完全未知的，不能直接用于监督训练；伪标签是模型</w:t>
+            </w:r>
+            <w:r>
+              <w:rPr>
+                <w:rFonts w:hint="eastAsia"/>
+              </w:rPr>
+              <w:t>"</w:t>
+            </w:r>
+            <w:r>
+              <w:rPr>
+                <w:rFonts w:hint="eastAsia"/>
+              </w:rPr>
+              <w:t>猜测</w:t>
+            </w:r>
+            <w:r>
+              <w:rPr>
+                <w:rFonts w:hint="eastAsia"/>
+              </w:rPr>
+              <w:t>"</w:t>
+            </w:r>
+            <w:r>
+              <w:rPr>
+                <w:rFonts w:hint="eastAsia"/>
+              </w:rPr>
+              <w:t>的标签，虽然不完全可靠（会有一定错误率），但经过置信度筛选后，已经可以作为弱监督信号加入训练。</w:t>
+            </w:r>
+          </w:p>
+          <w:p>
+            <w:pPr>
+              <w:spacing w:line="300" w:lineRule="auto"/>
+            </w:pPr>
+            <w:r>
+              <w:rPr>
+                <w:rFonts w:hint="eastAsia"/>
+              </w:rPr>
+              <w:t>问题</w:t>
+            </w:r>
+            <w:r>
+              <w:rPr>
+                <w:rFonts w:hint="eastAsia"/>
+              </w:rPr>
+              <w:t>3</w:t>
+            </w:r>
+            <w:r>
+              <w:rPr>
+                <w:rFonts w:hint="eastAsia"/>
+              </w:rPr>
+              <w:t>：你数据中的</w:t>
+            </w:r>
+            <w:r>
+              <w:rPr>
+                <w:rFonts w:hint="eastAsia"/>
+              </w:rPr>
+              <w:t>90.7</w:t>
+            </w:r>
+            <w:r>
+              <w:rPr>
+                <w:rFonts w:hint="eastAsia"/>
+              </w:rPr>
+              <w:t>是怎么来的？代表什么含义？</w:t>
+            </w:r>
+          </w:p>
+          <w:p>
+            <w:r>
+              <w:rPr>
+                <w:rFonts w:hint="eastAsia"/>
+              </w:rPr>
+              <w:t>90.7%</w:t>
+            </w:r>
+            <w:r>
+              <w:rPr>
+                <w:rFonts w:hint="eastAsia"/>
+              </w:rPr>
+              <w:t>是训练集上的准确率，来自</w:t>
+            </w:r>
+            <w:r>
+              <w:rPr>
+                <w:rFonts w:hint="eastAsia"/>
+              </w:rPr>
+              <w:t>Stage1</w:t>
+            </w:r>
+            <w:r>
+              <w:rPr>
+                <w:rFonts w:hint="eastAsia"/>
+              </w:rPr>
+              <w:t>训练日志第</w:t>
+            </w:r>
+            <w:r>
+              <w:rPr>
+                <w:rFonts w:hint="eastAsia"/>
+              </w:rPr>
+              <w:t>16</w:t>
+            </w:r>
+            <w:r>
+              <w:rPr>
+                <w:rFonts w:hint="eastAsia"/>
+              </w:rPr>
+              <w:t>个</w:t>
+            </w:r>
+            <w:r>
+              <w:rPr>
+                <w:rFonts w:hint="eastAsia"/>
+              </w:rPr>
+              <w:t>epoch</w:t>
+            </w:r>
+            <w:r>
+              <w:rPr>
+                <w:rFonts w:hint="eastAsia"/>
+              </w:rPr>
+              <w:t>记录：</w:t>
+            </w:r>
+            <w:r>
+              <w:rPr>
+                <w:rFonts w:hint="eastAsia"/>
+              </w:rPr>
+              <w:t>train_acc=0.907582804</w:t>
+            </w:r>
+            <w:r>
+              <w:rPr>
+                <w:rFonts w:hint="eastAsia"/>
+              </w:rPr>
+              <w:t>）。它表示在这个</w:t>
+            </w:r>
+            <w:r>
+              <w:rPr>
+                <w:rFonts w:hint="eastAsia"/>
+              </w:rPr>
+              <w:t>epoch</w:t>
+            </w:r>
+            <w:r>
+              <w:rPr>
+                <w:rFonts w:hint="eastAsia"/>
+              </w:rPr>
+              <w:t>，模型对自己已经见过的训练样本的分类正确率约为</w:t>
+            </w:r>
+            <w:r>
+              <w:rPr>
+                <w:rFonts w:hint="eastAsia"/>
+              </w:rPr>
+              <w:t>90.7%</w:t>
+            </w:r>
+            <w:r>
+              <w:rPr>
+                <w:rFonts w:hint="eastAsia"/>
+              </w:rPr>
+              <w:t>。</w:t>
+            </w:r>
+          </w:p>
+          <w:p>
+            <w:pPr>
+              <w:spacing w:line="300" w:lineRule="auto"/>
+            </w:pPr>
+            <w:r>
+              <w:t>问题</w:t>
+            </w:r>
+            <w:r>
+              <w:t>4:PLC</w:t>
+            </w:r>
+            <w:r>
+              <w:t>中</w:t>
+            </w:r>
+            <w:r>
+              <w:t>“</w:t>
+            </w:r>
+            <w:r>
+              <w:t>自锁</w:t>
+            </w:r>
+            <w:r>
+              <w:t>”</w:t>
+            </w:r>
+            <w:r>
+              <w:t>和</w:t>
+            </w:r>
+            <w:r>
+              <w:t>“</w:t>
+            </w:r>
+            <w:r>
+              <w:t>互锁</w:t>
+            </w:r>
+            <w:r>
+              <w:t>”</w:t>
+            </w:r>
+            <w:r>
+              <w:t>的区别</w:t>
+            </w:r>
+          </w:p>
+          <w:p>
+            <w:pPr>
+              <w:spacing w:line="300" w:lineRule="auto"/>
+              <w:rPr>
+                <w:rFonts w:ascii="宋体" w:hAnsi="宋体" w:hint="eastAsia"/>
+              </w:rPr>
+            </w:pPr>
+            <w:r>
+              <w:t>自锁</w:t>
+            </w:r>
+            <w:r>
+              <w:t>:</w:t>
+            </w:r>
+            <w:r>
+              <w:t>按下启动按钮后，线圈得电，辅助触点闭合，形成保持回路。互锁</w:t>
+            </w:r>
+            <w:r>
+              <w:t>:</w:t>
+            </w:r>
+            <w:r>
+              <w:t>在一个回路中串入另一个线圈的常闭触点，防止两个输出同时动作。</w:t>
+            </w:r>
           </w:p>
         </w:tc>
       </w:tr>
@@ -839,6 +1186,48 @@
                 <w:szCs w:val="21"/>
               </w:rPr>
             </w:pPr>
+            <w:r>
+              <w:rPr>
+                <w:bCs/>
+                <w:szCs w:val="21"/>
+              </w:rPr>
+              <w:t>2026</w:t>
+            </w:r>
+            <w:r>
+              <w:rPr>
+                <w:bCs/>
+                <w:szCs w:val="21"/>
+              </w:rPr>
+              <w:t>年</w:t>
+            </w:r>
+            <w:r>
+              <w:rPr>
+                <w:bCs/>
+                <w:szCs w:val="21"/>
+              </w:rPr>
+              <w:t>6</w:t>
+            </w:r>
+            <w:r>
+              <w:rPr>
+                <w:bCs/>
+                <w:szCs w:val="21"/>
+              </w:rPr>
+              <w:t>月</w:t>
+            </w:r>
+            <w:r>
+              <w:rPr>
+                <w:bCs/>
+                <w:szCs w:val="21"/>
+              </w:rPr>
+              <w:t>6</w:t>
+            </w:r>
+            <w:r>
+              <w:rPr>
+                <w:bCs/>
+                <w:szCs w:val="21"/>
+              </w:rPr>
+              <w:t>日</w:t>
+            </w:r>
           </w:p>
         </w:tc>
       </w:tr>
@@ -1262,7 +1651,6 @@
   <w:style w:type="character" w:default="1" w:styleId="a0">
     <w:name w:val="Default Paragraph Font"/>
     <w:uiPriority w:val="1"/>
-    <w:semiHidden/>
     <w:unhideWhenUsed/>
   </w:style>
   <w:style w:type="table" w:default="1" w:styleId="a1">

</xml_diff>